<commit_message>
Major Edits to Step 2 Write up
</commit_message>
<xml_diff>
--- a/Code/AI Data Generation Instructions.docx
+++ b/Code/AI Data Generation Instructions.docx
@@ -36,13 +36,19 @@
         <w:rPr>
           <w:rFonts w:ascii="Times New Roman" w:hAnsi="Times New Roman" w:cs="Times New Roman"/>
         </w:rPr>
-        <w:t>fars_Merging_with_safercar</w:t>
+        <w:t>crash_data.csv</w:t>
       </w:r>
       <w:r>
         <w:rPr>
           <w:rFonts w:ascii="Times New Roman" w:hAnsi="Times New Roman" w:cs="Times New Roman"/>
         </w:rPr>
-        <w:t>.csv” to have only the vehicle types that are involved in crashes in the data (</w:t>
+        <w:t>” to</w:t>
+      </w:r>
+      <w:r>
+        <w:rPr>
+          <w:rFonts w:ascii="Times New Roman" w:hAnsi="Times New Roman" w:cs="Times New Roman"/>
+        </w:rPr>
+        <w:t xml:space="preserve"> have only the vehicle types that are involved in crashes in the data (</w:t>
       </w:r>
       <w:proofErr w:type="gramStart"/>
       <w:r>
@@ -140,19 +146,7 @@
         <w:rPr>
           <w:rFonts w:ascii="Times New Roman" w:hAnsi="Times New Roman" w:cs="Times New Roman"/>
         </w:rPr>
-        <w:t xml:space="preserve">Export this into a </w:t>
-      </w:r>
-      <w:r>
-        <w:rPr>
-          <w:rFonts w:ascii="Times New Roman" w:hAnsi="Times New Roman" w:cs="Times New Roman"/>
-        </w:rPr>
-        <w:t xml:space="preserve">.csv </w:t>
-      </w:r>
-      <w:r>
-        <w:rPr>
-          <w:rFonts w:ascii="Times New Roman" w:hAnsi="Times New Roman" w:cs="Times New Roman"/>
-        </w:rPr>
-        <w:t>file and upload it to Google Sheets.</w:t>
+        <w:t>Export this into a .csv file and upload it to Google Sheets.</w:t>
       </w:r>
     </w:p>
     <w:p>
@@ -298,19 +292,7 @@
         <w:rPr>
           <w:rFonts w:ascii="Times New Roman" w:hAnsi="Times New Roman" w:cs="Times New Roman"/>
         </w:rPr>
-        <w:t xml:space="preserve">Load the </w:t>
-      </w:r>
-      <w:r>
-        <w:rPr>
-          <w:rFonts w:ascii="Times New Roman" w:hAnsi="Times New Roman" w:cs="Times New Roman"/>
-        </w:rPr>
-        <w:t>“AI Generated Car Dimensions.csv”</w:t>
-      </w:r>
-      <w:r>
-        <w:rPr>
-          <w:rFonts w:ascii="Times New Roman" w:hAnsi="Times New Roman" w:cs="Times New Roman"/>
-        </w:rPr>
-        <w:t xml:space="preserve"> into R and generate a 1% sample of the data. Check it manually using car manufacturer websites and databases.</w:t>
+        <w:t>Load the “AI Generated Car Dimensions.csv” into R and generate a 1% sample of the data. Check it manually using car manufacturer websites and databases.</w:t>
       </w:r>
     </w:p>
     <w:p>
@@ -328,19 +310,7 @@
         <w:rPr>
           <w:rFonts w:ascii="Times New Roman" w:hAnsi="Times New Roman" w:cs="Times New Roman"/>
         </w:rPr>
-        <w:t xml:space="preserve">Paste the completed </w:t>
-      </w:r>
-      <w:r>
-        <w:rPr>
-          <w:rFonts w:ascii="Times New Roman" w:hAnsi="Times New Roman" w:cs="Times New Roman"/>
-        </w:rPr>
-        <w:t>“AI Generated Car Dimensions.csv”</w:t>
-      </w:r>
-      <w:r>
-        <w:rPr>
-          <w:rFonts w:ascii="Times New Roman" w:hAnsi="Times New Roman" w:cs="Times New Roman"/>
-        </w:rPr>
-        <w:t xml:space="preserve"> into another AI (other than Gemini) and have it check the accuracy of the data. </w:t>
+        <w:t xml:space="preserve">Paste the completed “AI Generated Car Dimensions.csv” into another AI (other than Gemini) and have it check the accuracy of the data. </w:t>
       </w:r>
     </w:p>
     <w:p>
@@ -623,7 +593,6 @@
         <w:t xml:space="preserve"> </w:t>
       </w:r>
       <w:proofErr w:type="spellStart"/>
-      <w:proofErr w:type="gramStart"/>
       <w:r>
         <w:rPr>
           <w:rFonts w:ascii="Roboto Mono" w:eastAsia="Times New Roman" w:hAnsi="Roboto Mono" w:cs="Times New Roman"/>
@@ -645,19 +614,7 @@
           <w:szCs w:val="20"/>
           <w14:ligatures w14:val="none"/>
         </w:rPr>
-        <w:t>(</w:t>
-      </w:r>
-      <w:proofErr w:type="gramEnd"/>
-      <w:r>
-        <w:rPr>
-          <w:rFonts w:ascii="Roboto Mono" w:eastAsia="Times New Roman" w:hAnsi="Roboto Mono" w:cs="Times New Roman"/>
-          <w:color w:val="3C4043"/>
-          <w:kern w:val="0"/>
-          <w:sz w:val="20"/>
-          <w:szCs w:val="20"/>
-          <w14:ligatures w14:val="none"/>
-        </w:rPr>
-        <w:t>) {</w:t>
+        <w:t>() {</w:t>
       </w:r>
     </w:p>
     <w:p>
@@ -857,7 +814,6 @@
         <w:t xml:space="preserve"> = </w:t>
       </w:r>
       <w:proofErr w:type="spellStart"/>
-      <w:proofErr w:type="gramStart"/>
       <w:r>
         <w:rPr>
           <w:rFonts w:ascii="Roboto Mono" w:eastAsia="Times New Roman" w:hAnsi="Roboto Mono" w:cs="Times New Roman"/>
@@ -892,7 +848,6 @@
         <w:t>getActiveSheet</w:t>
       </w:r>
       <w:proofErr w:type="spellEnd"/>
-      <w:proofErr w:type="gramEnd"/>
       <w:r>
         <w:rPr>
           <w:rFonts w:ascii="Roboto Mono" w:eastAsia="Times New Roman" w:hAnsi="Roboto Mono" w:cs="Times New Roman"/>
@@ -967,7 +922,6 @@
         </w:rPr>
         <w:t xml:space="preserve">  </w:t>
       </w:r>
-      <w:proofErr w:type="gramStart"/>
       <w:r>
         <w:rPr>
           <w:rFonts w:ascii="Roboto Mono" w:eastAsia="Times New Roman" w:hAnsi="Roboto Mono" w:cs="Times New Roman"/>
@@ -1012,7 +966,6 @@
         </w:rPr>
         <w:t>(</w:t>
       </w:r>
-      <w:proofErr w:type="gramEnd"/>
       <w:r>
         <w:rPr>
           <w:rFonts w:ascii="Roboto Mono" w:eastAsia="Times New Roman" w:hAnsi="Roboto Mono" w:cs="Times New Roman"/>
@@ -1036,7 +989,6 @@
         <w:t xml:space="preserve"> + </w:t>
       </w:r>
       <w:proofErr w:type="spellStart"/>
-      <w:proofErr w:type="gramStart"/>
       <w:r>
         <w:rPr>
           <w:rFonts w:ascii="Roboto Mono" w:eastAsia="Times New Roman" w:hAnsi="Roboto Mono" w:cs="Times New Roman"/>
@@ -1071,7 +1023,6 @@
         <w:t>getName</w:t>
       </w:r>
       <w:proofErr w:type="spellEnd"/>
-      <w:proofErr w:type="gramEnd"/>
       <w:r>
         <w:rPr>
           <w:rFonts w:ascii="Roboto Mono" w:eastAsia="Times New Roman" w:hAnsi="Roboto Mono" w:cs="Times New Roman"/>
@@ -1182,7 +1133,6 @@
         <w:t xml:space="preserve"> = </w:t>
       </w:r>
       <w:proofErr w:type="spellStart"/>
-      <w:proofErr w:type="gramStart"/>
       <w:r>
         <w:rPr>
           <w:rFonts w:ascii="Roboto Mono" w:eastAsia="Times New Roman" w:hAnsi="Roboto Mono" w:cs="Times New Roman"/>
@@ -1217,7 +1167,6 @@
         <w:t>getLastRow</w:t>
       </w:r>
       <w:proofErr w:type="spellEnd"/>
-      <w:proofErr w:type="gramEnd"/>
       <w:r>
         <w:rPr>
           <w:rFonts w:ascii="Roboto Mono" w:eastAsia="Times New Roman" w:hAnsi="Roboto Mono" w:cs="Times New Roman"/>
@@ -1267,7 +1216,6 @@
         </w:rPr>
         <w:t xml:space="preserve">  </w:t>
       </w:r>
-      <w:proofErr w:type="gramStart"/>
       <w:r>
         <w:rPr>
           <w:rFonts w:ascii="Roboto Mono" w:eastAsia="Times New Roman" w:hAnsi="Roboto Mono" w:cs="Times New Roman"/>
@@ -1312,7 +1260,6 @@
         </w:rPr>
         <w:t>(</w:t>
       </w:r>
-      <w:proofErr w:type="gramEnd"/>
       <w:r>
         <w:rPr>
           <w:rFonts w:ascii="Roboto Mono" w:eastAsia="Times New Roman" w:hAnsi="Roboto Mono" w:cs="Times New Roman"/>
@@ -1494,7 +1441,6 @@
         </w:rPr>
         <w:t xml:space="preserve">    </w:t>
       </w:r>
-      <w:proofErr w:type="gramStart"/>
       <w:r>
         <w:rPr>
           <w:rFonts w:ascii="Roboto Mono" w:eastAsia="Times New Roman" w:hAnsi="Roboto Mono" w:cs="Times New Roman"/>
@@ -1539,7 +1485,6 @@
         </w:rPr>
         <w:t>(</w:t>
       </w:r>
-      <w:proofErr w:type="gramEnd"/>
       <w:r>
         <w:rPr>
           <w:rFonts w:ascii="Roboto Mono" w:eastAsia="Times New Roman" w:hAnsi="Roboto Mono" w:cs="Times New Roman"/>
@@ -1758,7 +1703,6 @@
         <w:t xml:space="preserve"> = </w:t>
       </w:r>
       <w:proofErr w:type="spellStart"/>
-      <w:proofErr w:type="gramStart"/>
       <w:r>
         <w:rPr>
           <w:rFonts w:ascii="Roboto Mono" w:eastAsia="Times New Roman" w:hAnsi="Roboto Mono" w:cs="Times New Roman"/>
@@ -1793,7 +1737,6 @@
         <w:t>getRange</w:t>
       </w:r>
       <w:proofErr w:type="spellEnd"/>
-      <w:proofErr w:type="gramEnd"/>
       <w:r>
         <w:rPr>
           <w:rFonts w:ascii="Roboto Mono" w:eastAsia="Times New Roman" w:hAnsi="Roboto Mono" w:cs="Times New Roman"/>
@@ -1906,7 +1849,6 @@
         </w:rPr>
         <w:t>4</w:t>
       </w:r>
-      <w:proofErr w:type="gramStart"/>
       <w:r>
         <w:rPr>
           <w:rFonts w:ascii="Roboto Mono" w:eastAsia="Times New Roman" w:hAnsi="Roboto Mono" w:cs="Times New Roman"/>
@@ -1931,7 +1873,6 @@
         <w:t>getValues</w:t>
       </w:r>
       <w:proofErr w:type="spellEnd"/>
-      <w:proofErr w:type="gramEnd"/>
       <w:r>
         <w:rPr>
           <w:rFonts w:ascii="Roboto Mono" w:eastAsia="Times New Roman" w:hAnsi="Roboto Mono" w:cs="Times New Roman"/>
@@ -2121,7 +2062,6 @@
         <w:t xml:space="preserve"> &lt; </w:t>
       </w:r>
       <w:proofErr w:type="spellStart"/>
-      <w:proofErr w:type="gramStart"/>
       <w:r>
         <w:rPr>
           <w:rFonts w:ascii="Roboto Mono" w:eastAsia="Times New Roman" w:hAnsi="Roboto Mono" w:cs="Times New Roman"/>
@@ -2156,7 +2096,6 @@
         <w:t>length</w:t>
       </w:r>
       <w:proofErr w:type="spellEnd"/>
-      <w:proofErr w:type="gramEnd"/>
       <w:r>
         <w:rPr>
           <w:rFonts w:ascii="Roboto Mono" w:eastAsia="Times New Roman" w:hAnsi="Roboto Mono" w:cs="Times New Roman"/>
@@ -2468,7 +2407,6 @@
         <w:t xml:space="preserve"> = </w:t>
       </w:r>
       <w:proofErr w:type="spellStart"/>
-      <w:proofErr w:type="gramStart"/>
       <w:r>
         <w:rPr>
           <w:rFonts w:ascii="Roboto Mono" w:eastAsia="Times New Roman" w:hAnsi="Roboto Mono" w:cs="Times New Roman"/>
@@ -2503,7 +2441,6 @@
         <w:t>getRange</w:t>
       </w:r>
       <w:proofErr w:type="spellEnd"/>
-      <w:proofErr w:type="gramEnd"/>
       <w:r>
         <w:rPr>
           <w:rFonts w:ascii="Roboto Mono" w:eastAsia="Times New Roman" w:hAnsi="Roboto Mono" w:cs="Times New Roman"/>
@@ -2550,7 +2487,6 @@
         </w:rPr>
         <w:t>5</w:t>
       </w:r>
-      <w:proofErr w:type="gramStart"/>
       <w:r>
         <w:rPr>
           <w:rFonts w:ascii="Roboto Mono" w:eastAsia="Times New Roman" w:hAnsi="Roboto Mono" w:cs="Times New Roman"/>
@@ -2575,7 +2511,6 @@
         <w:t>getValue</w:t>
       </w:r>
       <w:proofErr w:type="spellEnd"/>
-      <w:proofErr w:type="gramEnd"/>
       <w:r>
         <w:rPr>
           <w:rFonts w:ascii="Roboto Mono" w:eastAsia="Times New Roman" w:hAnsi="Roboto Mono" w:cs="Times New Roman"/>
@@ -2648,7 +2583,6 @@
         <w:t xml:space="preserve"> (</w:t>
       </w:r>
       <w:proofErr w:type="spellStart"/>
-      <w:proofErr w:type="gramStart"/>
       <w:r>
         <w:rPr>
           <w:rFonts w:ascii="Roboto Mono" w:eastAsia="Times New Roman" w:hAnsi="Roboto Mono" w:cs="Times New Roman"/>
@@ -2670,19 +2604,7 @@
           <w:szCs w:val="20"/>
           <w14:ligatures w14:val="none"/>
         </w:rPr>
-        <w:t xml:space="preserve"> !</w:t>
-      </w:r>
-      <w:proofErr w:type="gramEnd"/>
-      <w:r>
-        <w:rPr>
-          <w:rFonts w:ascii="Roboto Mono" w:eastAsia="Times New Roman" w:hAnsi="Roboto Mono" w:cs="Times New Roman"/>
-          <w:color w:val="3C4043"/>
-          <w:kern w:val="0"/>
-          <w:sz w:val="20"/>
-          <w:szCs w:val="20"/>
-          <w14:ligatures w14:val="none"/>
-        </w:rPr>
-        <w:t xml:space="preserve">== </w:t>
+        <w:t xml:space="preserve"> !== </w:t>
       </w:r>
       <w:r>
         <w:rPr>
@@ -3400,7 +3322,6 @@
         </w:rPr>
         <w:t xml:space="preserve">    </w:t>
       </w:r>
-      <w:proofErr w:type="gramStart"/>
       <w:r>
         <w:rPr>
           <w:rFonts w:ascii="Roboto Mono" w:eastAsia="Times New Roman" w:hAnsi="Roboto Mono" w:cs="Times New Roman"/>
@@ -3445,7 +3366,6 @@
         </w:rPr>
         <w:t>(</w:t>
       </w:r>
-      <w:proofErr w:type="gramEnd"/>
       <w:r>
         <w:rPr>
           <w:rFonts w:ascii="Roboto Mono" w:eastAsia="Times New Roman" w:hAnsi="Roboto Mono" w:cs="Times New Roman"/>
@@ -3944,7 +3864,7 @@
           <w:szCs w:val="20"/>
           <w14:ligatures w14:val="none"/>
         </w:rPr>
-        <w:t xml:space="preserve">    No units, no letters. Example format: 1500, 1450, 4800, </w:t>
+        <w:t xml:space="preserve">    No units, no letters. Example format: 1500, 1450, 4800, 1850.</w:t>
       </w:r>
       <w:proofErr w:type="gramStart"/>
       <w:r>
@@ -3956,20 +3876,20 @@
           <w:szCs w:val="20"/>
           <w14:ligatures w14:val="none"/>
         </w:rPr>
-        <w:t>1850.`</w:t>
+        <w:t>`</w:t>
+      </w:r>
+      <w:r>
+        <w:rPr>
+          <w:rFonts w:ascii="Roboto Mono" w:eastAsia="Times New Roman" w:hAnsi="Roboto Mono" w:cs="Times New Roman"/>
+          <w:color w:val="3C4043"/>
+          <w:kern w:val="0"/>
+          <w:sz w:val="20"/>
+          <w:szCs w:val="20"/>
+          <w14:ligatures w14:val="none"/>
+        </w:rPr>
+        <w:t>;</w:t>
       </w:r>
       <w:proofErr w:type="gramEnd"/>
-      <w:r>
-        <w:rPr>
-          <w:rFonts w:ascii="Roboto Mono" w:eastAsia="Times New Roman" w:hAnsi="Roboto Mono" w:cs="Times New Roman"/>
-          <w:color w:val="3C4043"/>
-          <w:kern w:val="0"/>
-          <w:sz w:val="20"/>
-          <w:szCs w:val="20"/>
-          <w14:ligatures w14:val="none"/>
-        </w:rPr>
-        <w:t>;</w:t>
-      </w:r>
     </w:p>
     <w:p>
       <w:pPr>
@@ -4218,7 +4138,6 @@
         <w:t xml:space="preserve"> = </w:t>
       </w:r>
       <w:proofErr w:type="spellStart"/>
-      <w:proofErr w:type="gramStart"/>
       <w:r>
         <w:rPr>
           <w:rFonts w:ascii="Roboto Mono" w:eastAsia="Times New Roman" w:hAnsi="Roboto Mono" w:cs="Times New Roman"/>
@@ -4253,7 +4172,6 @@
         <w:t>split</w:t>
       </w:r>
       <w:proofErr w:type="spellEnd"/>
-      <w:proofErr w:type="gramEnd"/>
       <w:r>
         <w:rPr>
           <w:rFonts w:ascii="Roboto Mono" w:eastAsia="Times New Roman" w:hAnsi="Roboto Mono" w:cs="Times New Roman"/>
@@ -4362,7 +4280,6 @@
         <w:t xml:space="preserve"> (</w:t>
       </w:r>
       <w:proofErr w:type="spellStart"/>
-      <w:proofErr w:type="gramStart"/>
       <w:r>
         <w:rPr>
           <w:rFonts w:ascii="Roboto Mono" w:eastAsia="Times New Roman" w:hAnsi="Roboto Mono" w:cs="Times New Roman"/>
@@ -4397,7 +4314,6 @@
         <w:t>length</w:t>
       </w:r>
       <w:proofErr w:type="spellEnd"/>
-      <w:proofErr w:type="gramEnd"/>
       <w:r>
         <w:rPr>
           <w:rFonts w:ascii="Roboto Mono" w:eastAsia="Times New Roman" w:hAnsi="Roboto Mono" w:cs="Times New Roman"/>
@@ -4493,7 +4409,6 @@
         <w:t xml:space="preserve">        </w:t>
       </w:r>
       <w:proofErr w:type="spellStart"/>
-      <w:proofErr w:type="gramStart"/>
       <w:r>
         <w:rPr>
           <w:rFonts w:ascii="Roboto Mono" w:eastAsia="Times New Roman" w:hAnsi="Roboto Mono" w:cs="Times New Roman"/>
@@ -4528,7 +4443,6 @@
         <w:t>getRange</w:t>
       </w:r>
       <w:proofErr w:type="spellEnd"/>
-      <w:proofErr w:type="gramEnd"/>
       <w:r>
         <w:rPr>
           <w:rFonts w:ascii="Roboto Mono" w:eastAsia="Times New Roman" w:hAnsi="Roboto Mono" w:cs="Times New Roman"/>
@@ -4619,7 +4533,6 @@
         </w:rPr>
         <w:t>4</w:t>
       </w:r>
-      <w:proofErr w:type="gramStart"/>
       <w:r>
         <w:rPr>
           <w:rFonts w:ascii="Roboto Mono" w:eastAsia="Times New Roman" w:hAnsi="Roboto Mono" w:cs="Times New Roman"/>
@@ -4644,7 +4557,6 @@
         <w:t>setValues</w:t>
       </w:r>
       <w:proofErr w:type="spellEnd"/>
-      <w:proofErr w:type="gramEnd"/>
       <w:r>
         <w:rPr>
           <w:rFonts w:ascii="Roboto Mono" w:eastAsia="Times New Roman" w:hAnsi="Roboto Mono" w:cs="Times New Roman"/>
@@ -4689,7 +4601,6 @@
         </w:rPr>
         <w:t>0</w:t>
       </w:r>
-      <w:proofErr w:type="gramStart"/>
       <w:r>
         <w:rPr>
           <w:rFonts w:ascii="Roboto Mono" w:eastAsia="Times New Roman" w:hAnsi="Roboto Mono" w:cs="Times New Roman"/>
@@ -4712,7 +4623,6 @@
         </w:rPr>
         <w:t>trim</w:t>
       </w:r>
-      <w:proofErr w:type="gramEnd"/>
       <w:r>
         <w:rPr>
           <w:rFonts w:ascii="Roboto Mono" w:eastAsia="Times New Roman" w:hAnsi="Roboto Mono" w:cs="Times New Roman"/>
@@ -4757,7 +4667,6 @@
         </w:rPr>
         <w:t>1</w:t>
       </w:r>
-      <w:proofErr w:type="gramStart"/>
       <w:r>
         <w:rPr>
           <w:rFonts w:ascii="Roboto Mono" w:eastAsia="Times New Roman" w:hAnsi="Roboto Mono" w:cs="Times New Roman"/>
@@ -4780,7 +4689,6 @@
         </w:rPr>
         <w:t>trim</w:t>
       </w:r>
-      <w:proofErr w:type="gramEnd"/>
       <w:r>
         <w:rPr>
           <w:rFonts w:ascii="Roboto Mono" w:eastAsia="Times New Roman" w:hAnsi="Roboto Mono" w:cs="Times New Roman"/>
@@ -4825,7 +4733,6 @@
         </w:rPr>
         <w:t>2</w:t>
       </w:r>
-      <w:proofErr w:type="gramStart"/>
       <w:r>
         <w:rPr>
           <w:rFonts w:ascii="Roboto Mono" w:eastAsia="Times New Roman" w:hAnsi="Roboto Mono" w:cs="Times New Roman"/>
@@ -4848,7 +4755,6 @@
         </w:rPr>
         <w:t>trim</w:t>
       </w:r>
-      <w:proofErr w:type="gramEnd"/>
       <w:r>
         <w:rPr>
           <w:rFonts w:ascii="Roboto Mono" w:eastAsia="Times New Roman" w:hAnsi="Roboto Mono" w:cs="Times New Roman"/>
@@ -4893,7 +4799,6 @@
         </w:rPr>
         <w:t>3</w:t>
       </w:r>
-      <w:proofErr w:type="gramStart"/>
       <w:r>
         <w:rPr>
           <w:rFonts w:ascii="Roboto Mono" w:eastAsia="Times New Roman" w:hAnsi="Roboto Mono" w:cs="Times New Roman"/>
@@ -4916,7 +4821,6 @@
         </w:rPr>
         <w:t>trim</w:t>
       </w:r>
-      <w:proofErr w:type="gramEnd"/>
       <w:r>
         <w:rPr>
           <w:rFonts w:ascii="Roboto Mono" w:eastAsia="Times New Roman" w:hAnsi="Roboto Mono" w:cs="Times New Roman"/>
@@ -4966,7 +4870,6 @@
         </w:rPr>
         <w:t xml:space="preserve">        </w:t>
       </w:r>
-      <w:proofErr w:type="gramStart"/>
       <w:r>
         <w:rPr>
           <w:rFonts w:ascii="Roboto Mono" w:eastAsia="Times New Roman" w:hAnsi="Roboto Mono" w:cs="Times New Roman"/>
@@ -5011,7 +4914,6 @@
         </w:rPr>
         <w:t>(</w:t>
       </w:r>
-      <w:proofErr w:type="gramEnd"/>
       <w:r>
         <w:rPr>
           <w:rFonts w:ascii="Roboto Mono" w:eastAsia="Times New Roman" w:hAnsi="Roboto Mono" w:cs="Times New Roman"/>
@@ -5133,7 +5035,6 @@
         <w:lastRenderedPageBreak/>
         <w:t xml:space="preserve">        </w:t>
       </w:r>
-      <w:proofErr w:type="gramStart"/>
       <w:r>
         <w:rPr>
           <w:rFonts w:ascii="Roboto Mono" w:eastAsia="Times New Roman" w:hAnsi="Roboto Mono" w:cs="Times New Roman"/>
@@ -5178,7 +5079,6 @@
         </w:rPr>
         <w:t>(</w:t>
       </w:r>
-      <w:proofErr w:type="gramEnd"/>
       <w:r>
         <w:rPr>
           <w:rFonts w:ascii="Roboto Mono" w:eastAsia="Times New Roman" w:hAnsi="Roboto Mono" w:cs="Times New Roman"/>
@@ -5549,156 +5449,154 @@
         </w:rPr>
         <w:t xml:space="preserve">      </w:t>
       </w:r>
+      <w:r>
+        <w:rPr>
+          <w:rFonts w:ascii="Roboto Mono" w:eastAsia="Times New Roman" w:hAnsi="Roboto Mono" w:cs="Times New Roman"/>
+          <w:color w:val="C92786"/>
+          <w:kern w:val="0"/>
+          <w:sz w:val="20"/>
+          <w:szCs w:val="20"/>
+          <w14:ligatures w14:val="none"/>
+        </w:rPr>
+        <w:t>Logger</w:t>
+      </w:r>
+      <w:r>
+        <w:rPr>
+          <w:rFonts w:ascii="Roboto Mono" w:eastAsia="Times New Roman" w:hAnsi="Roboto Mono" w:cs="Times New Roman"/>
+          <w:color w:val="3C4043"/>
+          <w:kern w:val="0"/>
+          <w:sz w:val="20"/>
+          <w:szCs w:val="20"/>
+          <w14:ligatures w14:val="none"/>
+        </w:rPr>
+        <w:t>.</w:t>
+      </w:r>
+      <w:r>
+        <w:rPr>
+          <w:rFonts w:ascii="Roboto Mono" w:eastAsia="Times New Roman" w:hAnsi="Roboto Mono" w:cs="Times New Roman"/>
+          <w:color w:val="202124"/>
+          <w:kern w:val="0"/>
+          <w:sz w:val="20"/>
+          <w:szCs w:val="20"/>
+          <w14:ligatures w14:val="none"/>
+        </w:rPr>
+        <w:t>log</w:t>
+      </w:r>
+      <w:r>
+        <w:rPr>
+          <w:rFonts w:ascii="Roboto Mono" w:eastAsia="Times New Roman" w:hAnsi="Roboto Mono" w:cs="Times New Roman"/>
+          <w:color w:val="3C4043"/>
+          <w:kern w:val="0"/>
+          <w:sz w:val="20"/>
+          <w:szCs w:val="20"/>
+          <w14:ligatures w14:val="none"/>
+        </w:rPr>
+        <w:t>(</w:t>
+      </w:r>
+      <w:r>
+        <w:rPr>
+          <w:rFonts w:ascii="Roboto Mono" w:eastAsia="Times New Roman" w:hAnsi="Roboto Mono" w:cs="Times New Roman"/>
+          <w:color w:val="B31412"/>
+          <w:kern w:val="0"/>
+          <w:sz w:val="20"/>
+          <w:szCs w:val="20"/>
+          <w14:ligatures w14:val="none"/>
+        </w:rPr>
+        <w:t>"Error on row "</w:t>
+      </w:r>
+      <w:r>
+        <w:rPr>
+          <w:rFonts w:ascii="Roboto Mono" w:eastAsia="Times New Roman" w:hAnsi="Roboto Mono" w:cs="Times New Roman"/>
+          <w:color w:val="3C4043"/>
+          <w:kern w:val="0"/>
+          <w:sz w:val="20"/>
+          <w:szCs w:val="20"/>
+          <w14:ligatures w14:val="none"/>
+        </w:rPr>
+        <w:t xml:space="preserve"> + </w:t>
+      </w:r>
+      <w:proofErr w:type="spellStart"/>
+      <w:r>
+        <w:rPr>
+          <w:rFonts w:ascii="Roboto Mono" w:eastAsia="Times New Roman" w:hAnsi="Roboto Mono" w:cs="Times New Roman"/>
+          <w:color w:val="202124"/>
+          <w:kern w:val="0"/>
+          <w:sz w:val="20"/>
+          <w:szCs w:val="20"/>
+          <w14:ligatures w14:val="none"/>
+        </w:rPr>
+        <w:t>rowNum</w:t>
+      </w:r>
+      <w:proofErr w:type="spellEnd"/>
+      <w:r>
+        <w:rPr>
+          <w:rFonts w:ascii="Roboto Mono" w:eastAsia="Times New Roman" w:hAnsi="Roboto Mono" w:cs="Times New Roman"/>
+          <w:color w:val="3C4043"/>
+          <w:kern w:val="0"/>
+          <w:sz w:val="20"/>
+          <w:szCs w:val="20"/>
+          <w14:ligatures w14:val="none"/>
+        </w:rPr>
+        <w:t xml:space="preserve"> + </w:t>
+      </w:r>
+      <w:r>
+        <w:rPr>
+          <w:rFonts w:ascii="Roboto Mono" w:eastAsia="Times New Roman" w:hAnsi="Roboto Mono" w:cs="Times New Roman"/>
+          <w:color w:val="B31412"/>
+          <w:kern w:val="0"/>
+          <w:sz w:val="20"/>
+          <w:szCs w:val="20"/>
+          <w14:ligatures w14:val="none"/>
+        </w:rPr>
+        <w:t>": "</w:t>
+      </w:r>
+      <w:r>
+        <w:rPr>
+          <w:rFonts w:ascii="Roboto Mono" w:eastAsia="Times New Roman" w:hAnsi="Roboto Mono" w:cs="Times New Roman"/>
+          <w:color w:val="3C4043"/>
+          <w:kern w:val="0"/>
+          <w:sz w:val="20"/>
+          <w:szCs w:val="20"/>
+          <w14:ligatures w14:val="none"/>
+        </w:rPr>
+        <w:t xml:space="preserve"> + </w:t>
+      </w:r>
+      <w:proofErr w:type="spellStart"/>
+      <w:r>
+        <w:rPr>
+          <w:rFonts w:ascii="Roboto Mono" w:eastAsia="Times New Roman" w:hAnsi="Roboto Mono" w:cs="Times New Roman"/>
+          <w:color w:val="202124"/>
+          <w:kern w:val="0"/>
+          <w:sz w:val="20"/>
+          <w:szCs w:val="20"/>
+          <w14:ligatures w14:val="none"/>
+        </w:rPr>
+        <w:t>e</w:t>
+      </w:r>
+      <w:r>
+        <w:rPr>
+          <w:rFonts w:ascii="Roboto Mono" w:eastAsia="Times New Roman" w:hAnsi="Roboto Mono" w:cs="Times New Roman"/>
+          <w:color w:val="3C4043"/>
+          <w:kern w:val="0"/>
+          <w:sz w:val="20"/>
+          <w:szCs w:val="20"/>
+          <w14:ligatures w14:val="none"/>
+        </w:rPr>
+        <w:t>.</w:t>
+      </w:r>
+      <w:r>
+        <w:rPr>
+          <w:rFonts w:ascii="Roboto Mono" w:eastAsia="Times New Roman" w:hAnsi="Roboto Mono" w:cs="Times New Roman"/>
+          <w:color w:val="202124"/>
+          <w:kern w:val="0"/>
+          <w:sz w:val="20"/>
+          <w:szCs w:val="20"/>
+          <w14:ligatures w14:val="none"/>
+        </w:rPr>
+        <w:t>message</w:t>
+      </w:r>
+      <w:proofErr w:type="spellEnd"/>
       <w:proofErr w:type="gramStart"/>
-      <w:r>
-        <w:rPr>
-          <w:rFonts w:ascii="Roboto Mono" w:eastAsia="Times New Roman" w:hAnsi="Roboto Mono" w:cs="Times New Roman"/>
-          <w:color w:val="C92786"/>
-          <w:kern w:val="0"/>
-          <w:sz w:val="20"/>
-          <w:szCs w:val="20"/>
-          <w14:ligatures w14:val="none"/>
-        </w:rPr>
-        <w:t>Logger</w:t>
-      </w:r>
-      <w:r>
-        <w:rPr>
-          <w:rFonts w:ascii="Roboto Mono" w:eastAsia="Times New Roman" w:hAnsi="Roboto Mono" w:cs="Times New Roman"/>
-          <w:color w:val="3C4043"/>
-          <w:kern w:val="0"/>
-          <w:sz w:val="20"/>
-          <w:szCs w:val="20"/>
-          <w14:ligatures w14:val="none"/>
-        </w:rPr>
-        <w:t>.</w:t>
-      </w:r>
-      <w:r>
-        <w:rPr>
-          <w:rFonts w:ascii="Roboto Mono" w:eastAsia="Times New Roman" w:hAnsi="Roboto Mono" w:cs="Times New Roman"/>
-          <w:color w:val="202124"/>
-          <w:kern w:val="0"/>
-          <w:sz w:val="20"/>
-          <w:szCs w:val="20"/>
-          <w14:ligatures w14:val="none"/>
-        </w:rPr>
-        <w:t>log</w:t>
-      </w:r>
-      <w:r>
-        <w:rPr>
-          <w:rFonts w:ascii="Roboto Mono" w:eastAsia="Times New Roman" w:hAnsi="Roboto Mono" w:cs="Times New Roman"/>
-          <w:color w:val="3C4043"/>
-          <w:kern w:val="0"/>
-          <w:sz w:val="20"/>
-          <w:szCs w:val="20"/>
-          <w14:ligatures w14:val="none"/>
-        </w:rPr>
-        <w:t>(</w:t>
-      </w:r>
-      <w:proofErr w:type="gramEnd"/>
-      <w:r>
-        <w:rPr>
-          <w:rFonts w:ascii="Roboto Mono" w:eastAsia="Times New Roman" w:hAnsi="Roboto Mono" w:cs="Times New Roman"/>
-          <w:color w:val="B31412"/>
-          <w:kern w:val="0"/>
-          <w:sz w:val="20"/>
-          <w:szCs w:val="20"/>
-          <w14:ligatures w14:val="none"/>
-        </w:rPr>
-        <w:t>"Error on row "</w:t>
-      </w:r>
-      <w:r>
-        <w:rPr>
-          <w:rFonts w:ascii="Roboto Mono" w:eastAsia="Times New Roman" w:hAnsi="Roboto Mono" w:cs="Times New Roman"/>
-          <w:color w:val="3C4043"/>
-          <w:kern w:val="0"/>
-          <w:sz w:val="20"/>
-          <w:szCs w:val="20"/>
-          <w14:ligatures w14:val="none"/>
-        </w:rPr>
-        <w:t xml:space="preserve"> + </w:t>
-      </w:r>
-      <w:proofErr w:type="spellStart"/>
-      <w:r>
-        <w:rPr>
-          <w:rFonts w:ascii="Roboto Mono" w:eastAsia="Times New Roman" w:hAnsi="Roboto Mono" w:cs="Times New Roman"/>
-          <w:color w:val="202124"/>
-          <w:kern w:val="0"/>
-          <w:sz w:val="20"/>
-          <w:szCs w:val="20"/>
-          <w14:ligatures w14:val="none"/>
-        </w:rPr>
-        <w:t>rowNum</w:t>
-      </w:r>
-      <w:proofErr w:type="spellEnd"/>
-      <w:r>
-        <w:rPr>
-          <w:rFonts w:ascii="Roboto Mono" w:eastAsia="Times New Roman" w:hAnsi="Roboto Mono" w:cs="Times New Roman"/>
-          <w:color w:val="3C4043"/>
-          <w:kern w:val="0"/>
-          <w:sz w:val="20"/>
-          <w:szCs w:val="20"/>
-          <w14:ligatures w14:val="none"/>
-        </w:rPr>
-        <w:t xml:space="preserve"> + </w:t>
-      </w:r>
-      <w:r>
-        <w:rPr>
-          <w:rFonts w:ascii="Roboto Mono" w:eastAsia="Times New Roman" w:hAnsi="Roboto Mono" w:cs="Times New Roman"/>
-          <w:color w:val="B31412"/>
-          <w:kern w:val="0"/>
-          <w:sz w:val="20"/>
-          <w:szCs w:val="20"/>
-          <w14:ligatures w14:val="none"/>
-        </w:rPr>
-        <w:t>": "</w:t>
-      </w:r>
-      <w:r>
-        <w:rPr>
-          <w:rFonts w:ascii="Roboto Mono" w:eastAsia="Times New Roman" w:hAnsi="Roboto Mono" w:cs="Times New Roman"/>
-          <w:color w:val="3C4043"/>
-          <w:kern w:val="0"/>
-          <w:sz w:val="20"/>
-          <w:szCs w:val="20"/>
-          <w14:ligatures w14:val="none"/>
-        </w:rPr>
-        <w:t xml:space="preserve"> + </w:t>
-      </w:r>
-      <w:proofErr w:type="spellStart"/>
-      <w:proofErr w:type="gramStart"/>
-      <w:r>
-        <w:rPr>
-          <w:rFonts w:ascii="Roboto Mono" w:eastAsia="Times New Roman" w:hAnsi="Roboto Mono" w:cs="Times New Roman"/>
-          <w:color w:val="202124"/>
-          <w:kern w:val="0"/>
-          <w:sz w:val="20"/>
-          <w:szCs w:val="20"/>
-          <w14:ligatures w14:val="none"/>
-        </w:rPr>
-        <w:t>e</w:t>
-      </w:r>
-      <w:r>
-        <w:rPr>
-          <w:rFonts w:ascii="Roboto Mono" w:eastAsia="Times New Roman" w:hAnsi="Roboto Mono" w:cs="Times New Roman"/>
-          <w:color w:val="3C4043"/>
-          <w:kern w:val="0"/>
-          <w:sz w:val="20"/>
-          <w:szCs w:val="20"/>
-          <w14:ligatures w14:val="none"/>
-        </w:rPr>
-        <w:t>.</w:t>
-      </w:r>
-      <w:r>
-        <w:rPr>
-          <w:rFonts w:ascii="Roboto Mono" w:eastAsia="Times New Roman" w:hAnsi="Roboto Mono" w:cs="Times New Roman"/>
-          <w:color w:val="202124"/>
-          <w:kern w:val="0"/>
-          <w:sz w:val="20"/>
-          <w:szCs w:val="20"/>
-          <w14:ligatures w14:val="none"/>
-        </w:rPr>
-        <w:t>message</w:t>
-      </w:r>
-      <w:proofErr w:type="spellEnd"/>
       <w:r>
         <w:rPr>
           <w:rFonts w:ascii="Roboto Mono" w:eastAsia="Times New Roman" w:hAnsi="Roboto Mono" w:cs="Times New Roman"/>
@@ -5949,7 +5847,95 @@
           <w:szCs w:val="20"/>
           <w14:ligatures w14:val="none"/>
         </w:rPr>
-        <w:t xml:space="preserve"> = </w:t>
+        <w:t xml:space="preserve"> = { </w:t>
+      </w:r>
+      <w:r>
+        <w:rPr>
+          <w:rFonts w:ascii="Roboto Mono" w:eastAsia="Times New Roman" w:hAnsi="Roboto Mono" w:cs="Times New Roman"/>
+          <w:color w:val="B31412"/>
+          <w:kern w:val="0"/>
+          <w:sz w:val="20"/>
+          <w:szCs w:val="20"/>
+          <w14:ligatures w14:val="none"/>
+        </w:rPr>
+        <w:t>"contents"</w:t>
+      </w:r>
+      <w:r>
+        <w:rPr>
+          <w:rFonts w:ascii="Roboto Mono" w:eastAsia="Times New Roman" w:hAnsi="Roboto Mono" w:cs="Times New Roman"/>
+          <w:color w:val="3C4043"/>
+          <w:kern w:val="0"/>
+          <w:sz w:val="20"/>
+          <w:szCs w:val="20"/>
+          <w14:ligatures w14:val="none"/>
+        </w:rPr>
+        <w:t xml:space="preserve">: [{ </w:t>
+      </w:r>
+      <w:r>
+        <w:rPr>
+          <w:rFonts w:ascii="Roboto Mono" w:eastAsia="Times New Roman" w:hAnsi="Roboto Mono" w:cs="Times New Roman"/>
+          <w:color w:val="B31412"/>
+          <w:kern w:val="0"/>
+          <w:sz w:val="20"/>
+          <w:szCs w:val="20"/>
+          <w14:ligatures w14:val="none"/>
+        </w:rPr>
+        <w:t>"parts"</w:t>
+      </w:r>
+      <w:r>
+        <w:rPr>
+          <w:rFonts w:ascii="Roboto Mono" w:eastAsia="Times New Roman" w:hAnsi="Roboto Mono" w:cs="Times New Roman"/>
+          <w:color w:val="3C4043"/>
+          <w:kern w:val="0"/>
+          <w:sz w:val="20"/>
+          <w:szCs w:val="20"/>
+          <w14:ligatures w14:val="none"/>
+        </w:rPr>
+        <w:t xml:space="preserve">: [{ </w:t>
+      </w:r>
+      <w:r>
+        <w:rPr>
+          <w:rFonts w:ascii="Roboto Mono" w:eastAsia="Times New Roman" w:hAnsi="Roboto Mono" w:cs="Times New Roman"/>
+          <w:color w:val="B31412"/>
+          <w:kern w:val="0"/>
+          <w:sz w:val="20"/>
+          <w:szCs w:val="20"/>
+          <w14:ligatures w14:val="none"/>
+        </w:rPr>
+        <w:t>"text"</w:t>
+      </w:r>
+      <w:r>
+        <w:rPr>
+          <w:rFonts w:ascii="Roboto Mono" w:eastAsia="Times New Roman" w:hAnsi="Roboto Mono" w:cs="Times New Roman"/>
+          <w:color w:val="3C4043"/>
+          <w:kern w:val="0"/>
+          <w:sz w:val="20"/>
+          <w:szCs w:val="20"/>
+          <w14:ligatures w14:val="none"/>
+        </w:rPr>
+        <w:t xml:space="preserve">: </w:t>
+      </w:r>
+      <w:r>
+        <w:rPr>
+          <w:rFonts w:ascii="Roboto Mono" w:eastAsia="Times New Roman" w:hAnsi="Roboto Mono" w:cs="Times New Roman"/>
+          <w:color w:val="202124"/>
+          <w:kern w:val="0"/>
+          <w:sz w:val="20"/>
+          <w:szCs w:val="20"/>
+          <w14:ligatures w14:val="none"/>
+        </w:rPr>
+        <w:t>prompt</w:t>
+      </w:r>
+      <w:r>
+        <w:rPr>
+          <w:rFonts w:ascii="Roboto Mono" w:eastAsia="Times New Roman" w:hAnsi="Roboto Mono" w:cs="Times New Roman"/>
+          <w:color w:val="3C4043"/>
+          <w:kern w:val="0"/>
+          <w:sz w:val="20"/>
+          <w:szCs w:val="20"/>
+          <w14:ligatures w14:val="none"/>
+        </w:rPr>
+        <w:t xml:space="preserve"> }] }] </w:t>
       </w:r>
       <w:proofErr w:type="gramStart"/>
       <w:r>
@@ -5961,193 +5947,9 @@
           <w:szCs w:val="20"/>
           <w14:ligatures w14:val="none"/>
         </w:rPr>
-        <w:t xml:space="preserve">{ </w:t>
-      </w:r>
-      <w:r>
-        <w:rPr>
-          <w:rFonts w:ascii="Roboto Mono" w:eastAsia="Times New Roman" w:hAnsi="Roboto Mono" w:cs="Times New Roman"/>
-          <w:color w:val="B31412"/>
-          <w:kern w:val="0"/>
-          <w:sz w:val="20"/>
-          <w:szCs w:val="20"/>
-          <w14:ligatures w14:val="none"/>
-        </w:rPr>
-        <w:t>"</w:t>
+        <w:t>};</w:t>
       </w:r>
       <w:proofErr w:type="gramEnd"/>
-      <w:r>
-        <w:rPr>
-          <w:rFonts w:ascii="Roboto Mono" w:eastAsia="Times New Roman" w:hAnsi="Roboto Mono" w:cs="Times New Roman"/>
-          <w:color w:val="B31412"/>
-          <w:kern w:val="0"/>
-          <w:sz w:val="20"/>
-          <w:szCs w:val="20"/>
-          <w14:ligatures w14:val="none"/>
-        </w:rPr>
-        <w:t>contents"</w:t>
-      </w:r>
-      <w:r>
-        <w:rPr>
-          <w:rFonts w:ascii="Roboto Mono" w:eastAsia="Times New Roman" w:hAnsi="Roboto Mono" w:cs="Times New Roman"/>
-          <w:color w:val="3C4043"/>
-          <w:kern w:val="0"/>
-          <w:sz w:val="20"/>
-          <w:szCs w:val="20"/>
-          <w14:ligatures w14:val="none"/>
-        </w:rPr>
-        <w:t xml:space="preserve">: </w:t>
-      </w:r>
-      <w:proofErr w:type="gramStart"/>
-      <w:r>
-        <w:rPr>
-          <w:rFonts w:ascii="Roboto Mono" w:eastAsia="Times New Roman" w:hAnsi="Roboto Mono" w:cs="Times New Roman"/>
-          <w:color w:val="3C4043"/>
-          <w:kern w:val="0"/>
-          <w:sz w:val="20"/>
-          <w:szCs w:val="20"/>
-          <w14:ligatures w14:val="none"/>
-        </w:rPr>
-        <w:t xml:space="preserve">[{ </w:t>
-      </w:r>
-      <w:r>
-        <w:rPr>
-          <w:rFonts w:ascii="Roboto Mono" w:eastAsia="Times New Roman" w:hAnsi="Roboto Mono" w:cs="Times New Roman"/>
-          <w:color w:val="B31412"/>
-          <w:kern w:val="0"/>
-          <w:sz w:val="20"/>
-          <w:szCs w:val="20"/>
-          <w14:ligatures w14:val="none"/>
-        </w:rPr>
-        <w:t>"</w:t>
-      </w:r>
-      <w:proofErr w:type="gramEnd"/>
-      <w:r>
-        <w:rPr>
-          <w:rFonts w:ascii="Roboto Mono" w:eastAsia="Times New Roman" w:hAnsi="Roboto Mono" w:cs="Times New Roman"/>
-          <w:color w:val="B31412"/>
-          <w:kern w:val="0"/>
-          <w:sz w:val="20"/>
-          <w:szCs w:val="20"/>
-          <w14:ligatures w14:val="none"/>
-        </w:rPr>
-        <w:t>parts"</w:t>
-      </w:r>
-      <w:r>
-        <w:rPr>
-          <w:rFonts w:ascii="Roboto Mono" w:eastAsia="Times New Roman" w:hAnsi="Roboto Mono" w:cs="Times New Roman"/>
-          <w:color w:val="3C4043"/>
-          <w:kern w:val="0"/>
-          <w:sz w:val="20"/>
-          <w:szCs w:val="20"/>
-          <w14:ligatures w14:val="none"/>
-        </w:rPr>
-        <w:t xml:space="preserve">: </w:t>
-      </w:r>
-      <w:proofErr w:type="gramStart"/>
-      <w:r>
-        <w:rPr>
-          <w:rFonts w:ascii="Roboto Mono" w:eastAsia="Times New Roman" w:hAnsi="Roboto Mono" w:cs="Times New Roman"/>
-          <w:color w:val="3C4043"/>
-          <w:kern w:val="0"/>
-          <w:sz w:val="20"/>
-          <w:szCs w:val="20"/>
-          <w14:ligatures w14:val="none"/>
-        </w:rPr>
-        <w:t xml:space="preserve">[{ </w:t>
-      </w:r>
-      <w:r>
-        <w:rPr>
-          <w:rFonts w:ascii="Roboto Mono" w:eastAsia="Times New Roman" w:hAnsi="Roboto Mono" w:cs="Times New Roman"/>
-          <w:color w:val="B31412"/>
-          <w:kern w:val="0"/>
-          <w:sz w:val="20"/>
-          <w:szCs w:val="20"/>
-          <w14:ligatures w14:val="none"/>
-        </w:rPr>
-        <w:t>"</w:t>
-      </w:r>
-      <w:proofErr w:type="gramEnd"/>
-      <w:r>
-        <w:rPr>
-          <w:rFonts w:ascii="Roboto Mono" w:eastAsia="Times New Roman" w:hAnsi="Roboto Mono" w:cs="Times New Roman"/>
-          <w:color w:val="B31412"/>
-          <w:kern w:val="0"/>
-          <w:sz w:val="20"/>
-          <w:szCs w:val="20"/>
-          <w14:ligatures w14:val="none"/>
-        </w:rPr>
-        <w:t>text"</w:t>
-      </w:r>
-      <w:r>
-        <w:rPr>
-          <w:rFonts w:ascii="Roboto Mono" w:eastAsia="Times New Roman" w:hAnsi="Roboto Mono" w:cs="Times New Roman"/>
-          <w:color w:val="3C4043"/>
-          <w:kern w:val="0"/>
-          <w:sz w:val="20"/>
-          <w:szCs w:val="20"/>
-          <w14:ligatures w14:val="none"/>
-        </w:rPr>
-        <w:t xml:space="preserve">: </w:t>
-      </w:r>
-      <w:proofErr w:type="gramStart"/>
-      <w:r>
-        <w:rPr>
-          <w:rFonts w:ascii="Roboto Mono" w:eastAsia="Times New Roman" w:hAnsi="Roboto Mono" w:cs="Times New Roman"/>
-          <w:color w:val="202124"/>
-          <w:kern w:val="0"/>
-          <w:sz w:val="20"/>
-          <w:szCs w:val="20"/>
-          <w14:ligatures w14:val="none"/>
-        </w:rPr>
-        <w:t>prompt</w:t>
-      </w:r>
-      <w:r>
-        <w:rPr>
-          <w:rFonts w:ascii="Roboto Mono" w:eastAsia="Times New Roman" w:hAnsi="Roboto Mono" w:cs="Times New Roman"/>
-          <w:color w:val="3C4043"/>
-          <w:kern w:val="0"/>
-          <w:sz w:val="20"/>
-          <w:szCs w:val="20"/>
-          <w14:ligatures w14:val="none"/>
-        </w:rPr>
-        <w:t xml:space="preserve"> }</w:t>
-      </w:r>
-      <w:proofErr w:type="gramEnd"/>
-      <w:r>
-        <w:rPr>
-          <w:rFonts w:ascii="Roboto Mono" w:eastAsia="Times New Roman" w:hAnsi="Roboto Mono" w:cs="Times New Roman"/>
-          <w:color w:val="3C4043"/>
-          <w:kern w:val="0"/>
-          <w:sz w:val="20"/>
-          <w:szCs w:val="20"/>
-          <w14:ligatures w14:val="none"/>
-        </w:rPr>
-        <w:t>] }</w:t>
-      </w:r>
-      <w:proofErr w:type="gramStart"/>
-      <w:r>
-        <w:rPr>
-          <w:rFonts w:ascii="Roboto Mono" w:eastAsia="Times New Roman" w:hAnsi="Roboto Mono" w:cs="Times New Roman"/>
-          <w:color w:val="3C4043"/>
-          <w:kern w:val="0"/>
-          <w:sz w:val="20"/>
-          <w:szCs w:val="20"/>
-          <w14:ligatures w14:val="none"/>
-        </w:rPr>
-        <w:t>] }</w:t>
-      </w:r>
-      <w:proofErr w:type="gramEnd"/>
-      <w:r>
-        <w:rPr>
-          <w:rFonts w:ascii="Roboto Mono" w:eastAsia="Times New Roman" w:hAnsi="Roboto Mono" w:cs="Times New Roman"/>
-          <w:color w:val="3C4043"/>
-          <w:kern w:val="0"/>
-          <w:sz w:val="20"/>
-          <w:szCs w:val="20"/>
-          <w14:ligatures w14:val="none"/>
-        </w:rPr>
-        <w:t>;</w:t>
-      </w:r>
     </w:p>
     <w:p>
       <w:pPr>
@@ -6623,21 +6425,8 @@
           <w:szCs w:val="20"/>
           <w14:ligatures w14:val="none"/>
         </w:rPr>
-        <w:t xml:space="preserve">  </w:t>
-      </w:r>
-      <w:proofErr w:type="gramStart"/>
-      <w:r>
-        <w:rPr>
-          <w:rFonts w:ascii="Roboto Mono" w:eastAsia="Times New Roman" w:hAnsi="Roboto Mono" w:cs="Times New Roman"/>
-          <w:color w:val="3C4043"/>
-          <w:kern w:val="0"/>
-          <w:sz w:val="20"/>
-          <w:szCs w:val="20"/>
-          <w14:ligatures w14:val="none"/>
-        </w:rPr>
-        <w:t>};</w:t>
-      </w:r>
-      <w:proofErr w:type="gramEnd"/>
+        <w:t xml:space="preserve">  };</w:t>
+      </w:r>
     </w:p>
     <w:p>
       <w:pPr>
@@ -6917,7 +6706,6 @@
         <w:t>(</w:t>
       </w:r>
       <w:proofErr w:type="spellStart"/>
-      <w:proofErr w:type="gramStart"/>
       <w:r>
         <w:rPr>
           <w:rFonts w:ascii="Roboto Mono" w:eastAsia="Times New Roman" w:hAnsi="Roboto Mono" w:cs="Times New Roman"/>
@@ -6952,7 +6740,6 @@
         <w:t>getContentText</w:t>
       </w:r>
       <w:proofErr w:type="spellEnd"/>
-      <w:proofErr w:type="gramEnd"/>
       <w:r>
         <w:rPr>
           <w:rFonts w:ascii="Roboto Mono" w:eastAsia="Times New Roman" w:hAnsi="Roboto Mono" w:cs="Times New Roman"/>
@@ -7050,7 +6837,6 @@
         <w:t xml:space="preserve"> (</w:t>
       </w:r>
       <w:proofErr w:type="spellStart"/>
-      <w:proofErr w:type="gramStart"/>
       <w:r>
         <w:rPr>
           <w:rFonts w:ascii="Roboto Mono" w:eastAsia="Times New Roman" w:hAnsi="Roboto Mono" w:cs="Times New Roman"/>
@@ -7085,7 +6871,6 @@
         <w:t>candidates</w:t>
       </w:r>
       <w:proofErr w:type="spellEnd"/>
-      <w:proofErr w:type="gramEnd"/>
       <w:r>
         <w:rPr>
           <w:rFonts w:ascii="Roboto Mono" w:eastAsia="Times New Roman" w:hAnsi="Roboto Mono" w:cs="Times New Roman"/>
@@ -7098,7 +6883,6 @@
         <w:t xml:space="preserve"> &amp;&amp; </w:t>
       </w:r>
       <w:proofErr w:type="spellStart"/>
-      <w:proofErr w:type="gramStart"/>
       <w:r>
         <w:rPr>
           <w:rFonts w:ascii="Roboto Mono" w:eastAsia="Times New Roman" w:hAnsi="Roboto Mono" w:cs="Times New Roman"/>
@@ -7133,7 +6917,6 @@
         <w:t>candidates</w:t>
       </w:r>
       <w:proofErr w:type="spellEnd"/>
-      <w:proofErr w:type="gramEnd"/>
       <w:r>
         <w:rPr>
           <w:rFonts w:ascii="Roboto Mono" w:eastAsia="Times New Roman" w:hAnsi="Roboto Mono" w:cs="Times New Roman"/>
@@ -7156,7 +6939,6 @@
         </w:rPr>
         <w:t>0</w:t>
       </w:r>
-      <w:proofErr w:type="gramStart"/>
       <w:r>
         <w:rPr>
           <w:rFonts w:ascii="Roboto Mono" w:eastAsia="Times New Roman" w:hAnsi="Roboto Mono" w:cs="Times New Roman"/>
@@ -7179,7 +6961,6 @@
         </w:rPr>
         <w:t>content</w:t>
       </w:r>
-      <w:proofErr w:type="gramEnd"/>
       <w:r>
         <w:rPr>
           <w:rFonts w:ascii="Roboto Mono" w:eastAsia="Times New Roman" w:hAnsi="Roboto Mono" w:cs="Times New Roman"/>
@@ -7239,7 +7020,6 @@
         <w:t xml:space="preserve"> </w:t>
       </w:r>
       <w:proofErr w:type="spellStart"/>
-      <w:proofErr w:type="gramStart"/>
       <w:r>
         <w:rPr>
           <w:rFonts w:ascii="Roboto Mono" w:eastAsia="Times New Roman" w:hAnsi="Roboto Mono" w:cs="Times New Roman"/>
@@ -7274,7 +7054,6 @@
         <w:t>candidates</w:t>
       </w:r>
       <w:proofErr w:type="spellEnd"/>
-      <w:proofErr w:type="gramEnd"/>
       <w:r>
         <w:rPr>
           <w:rFonts w:ascii="Roboto Mono" w:eastAsia="Times New Roman" w:hAnsi="Roboto Mono" w:cs="Times New Roman"/>
@@ -7297,7 +7076,6 @@
         </w:rPr>
         <w:t>0</w:t>
       </w:r>
-      <w:proofErr w:type="gramStart"/>
       <w:r>
         <w:rPr>
           <w:rFonts w:ascii="Roboto Mono" w:eastAsia="Times New Roman" w:hAnsi="Roboto Mono" w:cs="Times New Roman"/>
@@ -7321,7 +7099,6 @@
         </w:rPr>
         <w:t>content</w:t>
       </w:r>
-      <w:proofErr w:type="gramEnd"/>
       <w:r>
         <w:rPr>
           <w:rFonts w:ascii="Roboto Mono" w:eastAsia="Times New Roman" w:hAnsi="Roboto Mono" w:cs="Times New Roman"/>
@@ -7333,7 +7110,6 @@
         </w:rPr>
         <w:t>.</w:t>
       </w:r>
-      <w:proofErr w:type="gramStart"/>
       <w:r>
         <w:rPr>
           <w:rFonts w:ascii="Roboto Mono" w:eastAsia="Times New Roman" w:hAnsi="Roboto Mono" w:cs="Times New Roman"/>
@@ -7357,7 +7133,6 @@
         </w:rPr>
         <w:t>[</w:t>
       </w:r>
-      <w:proofErr w:type="gramEnd"/>
       <w:r>
         <w:rPr>
           <w:rFonts w:ascii="Roboto Mono" w:eastAsia="Times New Roman" w:hAnsi="Roboto Mono" w:cs="Times New Roman"/>
@@ -7520,7 +7295,6 @@
         </w:rPr>
         <w:t xml:space="preserve"> </w:t>
       </w:r>
-      <w:proofErr w:type="gramStart"/>
       <w:r>
         <w:rPr>
           <w:rFonts w:ascii="Roboto Mono" w:eastAsia="Times New Roman" w:hAnsi="Roboto Mono" w:cs="Times New Roman"/>
@@ -7543,7 +7317,6 @@
         </w:rPr>
         <w:t>(</w:t>
       </w:r>
-      <w:proofErr w:type="gramEnd"/>
       <w:r>
         <w:rPr>
           <w:rFonts w:ascii="Roboto Mono" w:eastAsia="Times New Roman" w:hAnsi="Roboto Mono" w:cs="Times New Roman"/>

</xml_diff>